<commit_message>
docs: atualizar modelo DOCX da ficha cadastral
Atualiza o arquivo Ficha_Cadastral_Admissao_MODELO.docx para manter o template limpo, removendo os preenchimentos de placeholder e preservando a estrutura oficial do formulário.

Made-with: Cursor
</commit_message>
<xml_diff>
--- a/Ficha_Cadastral_Admissao_MODELO.docx
+++ b/Ficha_Cadastral_Admissao_MODELO.docx
@@ -35,9 +35,8 @@
             <w:tcW w:w="1851" w:type="dxa"/>
             <w:vMerge w:val="restart"/>
             <w:tcBorders>
-              <w:top w:val="single" w:sz="4" w:space="0" w:color="auto"/>
-              <w:left w:val="single" w:sz="4" w:space="0" w:color="auto"/>
-              <w:right w:val="single" w:sz="4" w:space="0" w:color="auto"/>
+              <w:top w:val="single" w:sz="12" w:space="0" w:color="auto"/>
+              <w:left w:val="single" w:sz="12" w:space="0" w:color="auto"/>
             </w:tcBorders>
             <w:tcMar>
               <w:top w:w="60" w:type="dxa"/>
@@ -123,10 +122,7 @@
             <w:tcW w:w="7127" w:type="dxa"/>
             <w:gridSpan w:val="2"/>
             <w:tcBorders>
-              <w:top w:val="single" w:sz="4" w:space="0" w:color="auto"/>
-              <w:left w:val="single" w:sz="4" w:space="0" w:color="auto"/>
-              <w:bottom w:val="single" w:sz="4" w:space="0" w:color="auto"/>
-              <w:right w:val="single" w:sz="4" w:space="0" w:color="auto"/>
+              <w:top w:val="single" w:sz="12" w:space="0" w:color="auto"/>
             </w:tcBorders>
             <w:shd w:val="clear" w:color="auto" w:fill="FFFFFF"/>
             <w:tcMar>
@@ -160,9 +156,8 @@
             <w:tcW w:w="2404" w:type="dxa"/>
             <w:vMerge w:val="restart"/>
             <w:tcBorders>
-              <w:top w:val="single" w:sz="4" w:space="0" w:color="auto"/>
-              <w:left w:val="single" w:sz="4" w:space="0" w:color="auto"/>
-              <w:right w:val="single" w:sz="4" w:space="0" w:color="auto"/>
+              <w:top w:val="single" w:sz="12" w:space="0" w:color="auto"/>
+              <w:right w:val="single" w:sz="12" w:space="0" w:color="auto"/>
             </w:tcBorders>
             <w:shd w:val="clear" w:color="auto" w:fill="FFFFFF"/>
           </w:tcPr>
@@ -185,16 +180,16 @@
                 <w:szCs w:val="16"/>
               </w:rPr>
               <w:drawing>
-                <wp:anchor distT="0" distB="0" distL="114300" distR="114300" simplePos="0" relativeHeight="251659264" behindDoc="0" locked="0" layoutInCell="1" allowOverlap="1" wp14:anchorId="09FA4572" wp14:editId="096D24BA">
+                <wp:anchor distT="0" distB="0" distL="114300" distR="114300" simplePos="0" relativeHeight="251659264" behindDoc="0" locked="0" layoutInCell="1" allowOverlap="1" wp14:anchorId="09FA4572" wp14:editId="1E829319">
                   <wp:simplePos x="0" y="0"/>
                   <wp:positionH relativeFrom="column">
-                    <wp:posOffset>136525</wp:posOffset>
+                    <wp:posOffset>166123</wp:posOffset>
                   </wp:positionH>
                   <wp:positionV relativeFrom="paragraph">
-                    <wp:posOffset>-40005</wp:posOffset>
+                    <wp:posOffset>-12700</wp:posOffset>
                   </wp:positionV>
-                  <wp:extent cx="1255361" cy="593002"/>
-                  <wp:effectExtent l="0" t="0" r="2540" b="0"/>
+                  <wp:extent cx="1199892" cy="566800"/>
+                  <wp:effectExtent l="0" t="0" r="635" b="5080"/>
                   <wp:wrapNone/>
                   <wp:docPr id="2" name="Imagem 2"/>
                   <wp:cNvGraphicFramePr>
@@ -222,7 +217,7 @@
                         <pic:spPr>
                           <a:xfrm>
                             <a:off x="0" y="0"/>
-                            <a:ext cx="1255361" cy="593002"/>
+                            <a:ext cx="1199892" cy="566800"/>
                           </a:xfrm>
                           <a:prstGeom prst="rect">
                             <a:avLst/>
@@ -252,9 +247,8 @@
             <w:tcW w:w="1851" w:type="dxa"/>
             <w:vMerge/>
             <w:tcBorders>
-              <w:left w:val="single" w:sz="4" w:space="0" w:color="auto"/>
-              <w:bottom w:val="single" w:sz="4" w:space="0" w:color="auto"/>
-              <w:right w:val="single" w:sz="4" w:space="0" w:color="auto"/>
+              <w:left w:val="single" w:sz="12" w:space="0" w:color="auto"/>
+              <w:bottom w:val="single" w:sz="12" w:space="0" w:color="auto"/>
             </w:tcBorders>
             <w:tcMar>
               <w:top w:w="60" w:type="dxa"/>
@@ -277,10 +271,7 @@
           <w:tcPr>
             <w:tcW w:w="3563" w:type="dxa"/>
             <w:tcBorders>
-              <w:top w:val="single" w:sz="4" w:space="0" w:color="auto"/>
-              <w:left w:val="single" w:sz="4" w:space="0" w:color="auto"/>
-              <w:bottom w:val="single" w:sz="4" w:space="0" w:color="auto"/>
-              <w:right w:val="single" w:sz="4" w:space="0" w:color="auto"/>
+              <w:bottom w:val="single" w:sz="12" w:space="0" w:color="auto"/>
             </w:tcBorders>
             <w:shd w:val="clear" w:color="auto" w:fill="FFFFFF"/>
             <w:tcMar>
@@ -315,10 +306,7 @@
           <w:tcPr>
             <w:tcW w:w="3564" w:type="dxa"/>
             <w:tcBorders>
-              <w:top w:val="single" w:sz="4" w:space="0" w:color="auto"/>
-              <w:left w:val="single" w:sz="4" w:space="0" w:color="auto"/>
-              <w:bottom w:val="single" w:sz="4" w:space="0" w:color="auto"/>
-              <w:right w:val="single" w:sz="4" w:space="0" w:color="auto"/>
+              <w:bottom w:val="single" w:sz="12" w:space="0" w:color="auto"/>
             </w:tcBorders>
             <w:shd w:val="clear" w:color="auto" w:fill="FFFFFF"/>
           </w:tcPr>
@@ -382,9 +370,8 @@
             <w:tcW w:w="2404" w:type="dxa"/>
             <w:vMerge/>
             <w:tcBorders>
-              <w:left w:val="single" w:sz="4" w:space="0" w:color="auto"/>
-              <w:bottom w:val="single" w:sz="4" w:space="0" w:color="auto"/>
-              <w:right w:val="single" w:sz="4" w:space="0" w:color="auto"/>
+              <w:bottom w:val="single" w:sz="12" w:space="0" w:color="auto"/>
+              <w:right w:val="single" w:sz="12" w:space="0" w:color="auto"/>
             </w:tcBorders>
             <w:shd w:val="clear" w:color="auto" w:fill="FFFFFF"/>
           </w:tcPr>
@@ -479,10 +466,10 @@
             <w:tcW w:w="11367" w:type="dxa"/>
             <w:gridSpan w:val="5"/>
             <w:tcBorders>
-              <w:top w:val="single" w:sz="2" w:space="0" w:color="000000"/>
-              <w:left w:val="single" w:sz="2" w:space="0" w:color="000000"/>
-              <w:bottom w:val="single" w:sz="2" w:space="0" w:color="000000"/>
-              <w:right w:val="single" w:sz="2" w:space="0" w:color="000000"/>
+              <w:top w:val="single" w:sz="12" w:space="0" w:color="auto"/>
+              <w:left w:val="single" w:sz="12" w:space="0" w:color="auto"/>
+              <w:bottom w:val="single" w:sz="12" w:space="0" w:color="auto"/>
+              <w:right w:val="single" w:sz="12" w:space="0" w:color="auto"/>
             </w:tcBorders>
             <w:shd w:val="clear" w:color="auto" w:fill="D9D9D9"/>
             <w:tcMar>
@@ -504,8 +491,8 @@
               <w:rPr>
                 <w:b/>
                 <w:bCs/>
-                <w:sz w:val="16"/>
-                <w:szCs w:val="16"/>
+                <w:sz w:val="20"/>
+                <w:szCs w:val="20"/>
               </w:rPr>
               <w:t>DADOS PESSOAIS</w:t>
             </w:r>
@@ -521,10 +508,10 @@
             <w:tcW w:w="11367" w:type="dxa"/>
             <w:gridSpan w:val="5"/>
             <w:tcBorders>
-              <w:top w:val="single" w:sz="2" w:space="0" w:color="000000"/>
-              <w:left w:val="single" w:sz="2" w:space="0" w:color="000000"/>
+              <w:top w:val="single" w:sz="12" w:space="0" w:color="auto"/>
+              <w:left w:val="single" w:sz="12" w:space="0" w:color="auto"/>
               <w:bottom w:val="single" w:sz="2" w:space="0" w:color="000000"/>
-              <w:right w:val="single" w:sz="2" w:space="0" w:color="000000"/>
+              <w:right w:val="single" w:sz="12" w:space="0" w:color="auto"/>
             </w:tcBorders>
             <w:tcMar>
               <w:top w:w="60" w:type="dxa"/>
@@ -569,15 +556,6 @@
                 <w:szCs w:val="16"/>
               </w:rPr>
             </w:pPr>
-            <w:r>
-              <w:rPr>
-                <w:b/>
-                <w:bCs/>
-                <w:sz w:val="16"/>
-                <w:szCs w:val="16"/>
-              </w:rPr>
-              <w:t>PREENCHER AQUI</w:t>
-            </w:r>
           </w:p>
         </w:tc>
       </w:tr>
@@ -591,9 +569,9 @@
             <w:gridSpan w:val="5"/>
             <w:tcBorders>
               <w:top w:val="single" w:sz="2" w:space="0" w:color="000000"/>
-              <w:left w:val="single" w:sz="2" w:space="0" w:color="000000"/>
+              <w:left w:val="single" w:sz="12" w:space="0" w:color="auto"/>
               <w:bottom w:val="single" w:sz="2" w:space="0" w:color="000000"/>
-              <w:right w:val="single" w:sz="2" w:space="0" w:color="000000"/>
+              <w:right w:val="single" w:sz="12" w:space="0" w:color="auto"/>
             </w:tcBorders>
             <w:tcMar>
               <w:top w:w="60" w:type="dxa"/>
@@ -637,15 +615,6 @@
                 <w:szCs w:val="16"/>
               </w:rPr>
             </w:pPr>
-            <w:r>
-              <w:rPr>
-                <w:b/>
-                <w:bCs/>
-                <w:sz w:val="16"/>
-                <w:szCs w:val="16"/>
-              </w:rPr>
-              <w:t>PREENCHER AQUI</w:t>
-            </w:r>
           </w:p>
         </w:tc>
       </w:tr>
@@ -659,7 +628,7 @@
             <w:gridSpan w:val="3"/>
             <w:tcBorders>
               <w:top w:val="single" w:sz="2" w:space="0" w:color="000000"/>
-              <w:left w:val="single" w:sz="2" w:space="0" w:color="000000"/>
+              <w:left w:val="single" w:sz="12" w:space="0" w:color="auto"/>
               <w:bottom w:val="single" w:sz="2" w:space="0" w:color="000000"/>
               <w:right w:val="single" w:sz="2" w:space="0" w:color="000000"/>
             </w:tcBorders>
@@ -695,15 +664,6 @@
                 <w:szCs w:val="16"/>
               </w:rPr>
             </w:pPr>
-            <w:r>
-              <w:rPr>
-                <w:b/>
-                <w:bCs/>
-                <w:sz w:val="16"/>
-                <w:szCs w:val="16"/>
-              </w:rPr>
-              <w:t>PREENCHER AQUI</w:t>
-            </w:r>
           </w:p>
         </w:tc>
         <w:tc>
@@ -714,7 +674,7 @@
               <w:top w:val="single" w:sz="2" w:space="0" w:color="000000"/>
               <w:left w:val="single" w:sz="2" w:space="0" w:color="000000"/>
               <w:bottom w:val="single" w:sz="2" w:space="0" w:color="000000"/>
-              <w:right w:val="single" w:sz="2" w:space="0" w:color="000000"/>
+              <w:right w:val="single" w:sz="12" w:space="0" w:color="auto"/>
             </w:tcBorders>
             <w:tcMar>
               <w:top w:w="60" w:type="dxa"/>
@@ -748,15 +708,6 @@
                 <w:szCs w:val="16"/>
               </w:rPr>
             </w:pPr>
-            <w:r>
-              <w:rPr>
-                <w:b/>
-                <w:bCs/>
-                <w:sz w:val="16"/>
-                <w:szCs w:val="16"/>
-              </w:rPr>
-              <w:t>PREENCHER AQUI</w:t>
-            </w:r>
           </w:p>
         </w:tc>
       </w:tr>
@@ -770,9 +721,9 @@
             <w:gridSpan w:val="5"/>
             <w:tcBorders>
               <w:top w:val="single" w:sz="2" w:space="0" w:color="000000"/>
-              <w:left w:val="single" w:sz="2" w:space="0" w:color="000000"/>
+              <w:left w:val="single" w:sz="12" w:space="0" w:color="auto"/>
               <w:bottom w:val="single" w:sz="2" w:space="0" w:color="000000"/>
-              <w:right w:val="single" w:sz="2" w:space="0" w:color="000000"/>
+              <w:right w:val="single" w:sz="12" w:space="0" w:color="auto"/>
             </w:tcBorders>
             <w:tcMar>
               <w:top w:w="60" w:type="dxa"/>
@@ -806,15 +757,6 @@
                 <w:szCs w:val="16"/>
               </w:rPr>
             </w:pPr>
-            <w:r>
-              <w:rPr>
-                <w:b/>
-                <w:bCs/>
-                <w:sz w:val="16"/>
-                <w:szCs w:val="16"/>
-              </w:rPr>
-              <w:t>PREENCHER AQUI</w:t>
-            </w:r>
           </w:p>
         </w:tc>
       </w:tr>
@@ -828,9 +770,9 @@
             <w:gridSpan w:val="5"/>
             <w:tcBorders>
               <w:top w:val="single" w:sz="2" w:space="0" w:color="000000"/>
-              <w:left w:val="single" w:sz="2" w:space="0" w:color="000000"/>
+              <w:left w:val="single" w:sz="12" w:space="0" w:color="auto"/>
               <w:bottom w:val="single" w:sz="2" w:space="0" w:color="000000"/>
-              <w:right w:val="single" w:sz="2" w:space="0" w:color="000000"/>
+              <w:right w:val="single" w:sz="12" w:space="0" w:color="auto"/>
             </w:tcBorders>
             <w:tcMar>
               <w:top w:w="60" w:type="dxa"/>
@@ -864,15 +806,6 @@
                 <w:szCs w:val="16"/>
               </w:rPr>
             </w:pPr>
-            <w:r>
-              <w:rPr>
-                <w:b/>
-                <w:bCs/>
-                <w:sz w:val="16"/>
-                <w:szCs w:val="16"/>
-              </w:rPr>
-              <w:t>PREENCHER AQUI</w:t>
-            </w:r>
           </w:p>
         </w:tc>
       </w:tr>
@@ -886,9 +819,9 @@
             <w:gridSpan w:val="5"/>
             <w:tcBorders>
               <w:top w:val="single" w:sz="2" w:space="0" w:color="000000"/>
-              <w:left w:val="single" w:sz="2" w:space="0" w:color="000000"/>
+              <w:left w:val="single" w:sz="12" w:space="0" w:color="auto"/>
               <w:bottom w:val="single" w:sz="2" w:space="0" w:color="000000"/>
-              <w:right w:val="single" w:sz="2" w:space="0" w:color="000000"/>
+              <w:right w:val="single" w:sz="12" w:space="0" w:color="auto"/>
             </w:tcBorders>
             <w:tcMar>
               <w:top w:w="60" w:type="dxa"/>
@@ -917,15 +850,6 @@
                 <w:szCs w:val="16"/>
               </w:rPr>
               <w:t xml:space="preserve"> </w:t>
-            </w:r>
-            <w:r>
-              <w:rPr>
-                <w:b/>
-                <w:bCs/>
-                <w:sz w:val="16"/>
-                <w:szCs w:val="16"/>
-              </w:rPr>
-              <w:t>PREENCHER AQUI</w:t>
             </w:r>
           </w:p>
         </w:tc>
@@ -940,7 +864,7 @@
             <w:gridSpan w:val="3"/>
             <w:tcBorders>
               <w:top w:val="single" w:sz="2" w:space="0" w:color="000000"/>
-              <w:left w:val="single" w:sz="2" w:space="0" w:color="000000"/>
+              <w:left w:val="single" w:sz="12" w:space="0" w:color="auto"/>
               <w:bottom w:val="single" w:sz="2" w:space="0" w:color="000000"/>
               <w:right w:val="single" w:sz="2" w:space="0" w:color="000000"/>
             </w:tcBorders>
@@ -976,15 +900,6 @@
                 <w:szCs w:val="16"/>
               </w:rPr>
             </w:pPr>
-            <w:r>
-              <w:rPr>
-                <w:b/>
-                <w:bCs/>
-                <w:sz w:val="16"/>
-                <w:szCs w:val="16"/>
-              </w:rPr>
-              <w:t>PREENCHER AQUI</w:t>
-            </w:r>
           </w:p>
         </w:tc>
         <w:tc>
@@ -1028,15 +943,6 @@
                 <w:szCs w:val="16"/>
               </w:rPr>
             </w:pPr>
-            <w:r>
-              <w:rPr>
-                <w:b/>
-                <w:bCs/>
-                <w:sz w:val="16"/>
-                <w:szCs w:val="16"/>
-              </w:rPr>
-              <w:t>PREENCHER AQUI</w:t>
-            </w:r>
           </w:p>
         </w:tc>
         <w:tc>
@@ -1046,7 +952,7 @@
               <w:top w:val="single" w:sz="2" w:space="0" w:color="000000"/>
               <w:left w:val="single" w:sz="2" w:space="0" w:color="000000"/>
               <w:bottom w:val="single" w:sz="2" w:space="0" w:color="000000"/>
-              <w:right w:val="single" w:sz="2" w:space="0" w:color="000000"/>
+              <w:right w:val="single" w:sz="12" w:space="0" w:color="auto"/>
             </w:tcBorders>
             <w:tcMar>
               <w:top w:w="60" w:type="dxa"/>
@@ -1080,15 +986,6 @@
                 <w:szCs w:val="16"/>
               </w:rPr>
             </w:pPr>
-            <w:r>
-              <w:rPr>
-                <w:b/>
-                <w:bCs/>
-                <w:sz w:val="16"/>
-                <w:szCs w:val="16"/>
-              </w:rPr>
-              <w:t>PREENCHER AQUI</w:t>
-            </w:r>
           </w:p>
         </w:tc>
       </w:tr>
@@ -1102,7 +999,7 @@
             <w:gridSpan w:val="3"/>
             <w:tcBorders>
               <w:top w:val="single" w:sz="2" w:space="0" w:color="000000"/>
-              <w:left w:val="single" w:sz="2" w:space="0" w:color="000000"/>
+              <w:left w:val="single" w:sz="12" w:space="0" w:color="auto"/>
               <w:bottom w:val="single" w:sz="2" w:space="0" w:color="000000"/>
               <w:right w:val="single" w:sz="2" w:space="0" w:color="000000"/>
             </w:tcBorders>
@@ -1138,15 +1035,6 @@
                 <w:szCs w:val="16"/>
               </w:rPr>
             </w:pPr>
-            <w:r>
-              <w:rPr>
-                <w:b/>
-                <w:bCs/>
-                <w:sz w:val="16"/>
-                <w:szCs w:val="16"/>
-              </w:rPr>
-              <w:t>PREENCHER AQUI</w:t>
-            </w:r>
           </w:p>
         </w:tc>
         <w:tc>
@@ -1190,15 +1078,6 @@
                 <w:szCs w:val="16"/>
               </w:rPr>
             </w:pPr>
-            <w:r>
-              <w:rPr>
-                <w:b/>
-                <w:bCs/>
-                <w:sz w:val="16"/>
-                <w:szCs w:val="16"/>
-              </w:rPr>
-              <w:t>PREENCHER AQUI</w:t>
-            </w:r>
           </w:p>
         </w:tc>
         <w:tc>
@@ -1208,7 +1087,7 @@
               <w:top w:val="single" w:sz="2" w:space="0" w:color="000000"/>
               <w:left w:val="single" w:sz="2" w:space="0" w:color="000000"/>
               <w:bottom w:val="single" w:sz="2" w:space="0" w:color="000000"/>
-              <w:right w:val="single" w:sz="2" w:space="0" w:color="000000"/>
+              <w:right w:val="single" w:sz="12" w:space="0" w:color="auto"/>
             </w:tcBorders>
             <w:tcMar>
               <w:top w:w="60" w:type="dxa"/>
@@ -1242,15 +1121,6 @@
                 <w:szCs w:val="16"/>
               </w:rPr>
             </w:pPr>
-            <w:r>
-              <w:rPr>
-                <w:b/>
-                <w:bCs/>
-                <w:sz w:val="16"/>
-                <w:szCs w:val="16"/>
-              </w:rPr>
-              <w:t>PREENCHER AQUI</w:t>
-            </w:r>
           </w:p>
         </w:tc>
       </w:tr>
@@ -1264,7 +1134,7 @@
             <w:gridSpan w:val="2"/>
             <w:tcBorders>
               <w:top w:val="single" w:sz="2" w:space="0" w:color="000000"/>
-              <w:left w:val="single" w:sz="2" w:space="0" w:color="000000"/>
+              <w:left w:val="single" w:sz="12" w:space="0" w:color="auto"/>
               <w:bottom w:val="single" w:sz="2" w:space="0" w:color="000000"/>
               <w:right w:val="single" w:sz="2" w:space="0" w:color="000000"/>
             </w:tcBorders>
@@ -1299,7 +1169,7 @@
               <w:top w:val="single" w:sz="2" w:space="0" w:color="000000"/>
               <w:left w:val="single" w:sz="2" w:space="0" w:color="000000"/>
               <w:bottom w:val="single" w:sz="2" w:space="0" w:color="000000"/>
-              <w:right w:val="single" w:sz="2" w:space="0" w:color="000000"/>
+              <w:right w:val="single" w:sz="12" w:space="0" w:color="auto"/>
             </w:tcBorders>
             <w:tcMar>
               <w:top w:w="60" w:type="dxa"/>
@@ -1352,7 +1222,7 @@
             <w:vMerge w:val="restart"/>
             <w:tcBorders>
               <w:top w:val="single" w:sz="2" w:space="0" w:color="000000"/>
-              <w:left w:val="single" w:sz="2" w:space="0" w:color="000000"/>
+              <w:left w:val="single" w:sz="12" w:space="0" w:color="auto"/>
               <w:bottom w:val="single" w:sz="2" w:space="0" w:color="000000"/>
               <w:right w:val="single" w:sz="2" w:space="0" w:color="000000"/>
             </w:tcBorders>
@@ -1433,7 +1303,7 @@
               <w:top w:val="single" w:sz="2" w:space="0" w:color="000000"/>
               <w:left w:val="single" w:sz="2" w:space="0" w:color="000000"/>
               <w:bottom w:val="single" w:sz="2" w:space="0" w:color="000000"/>
-              <w:right w:val="single" w:sz="2" w:space="0" w:color="000000"/>
+              <w:right w:val="single" w:sz="12" w:space="0" w:color="auto"/>
             </w:tcBorders>
             <w:tcMar>
               <w:top w:w="60" w:type="dxa"/>
@@ -1467,15 +1337,6 @@
                 <w:szCs w:val="16"/>
               </w:rPr>
             </w:pPr>
-            <w:r>
-              <w:rPr>
-                <w:b/>
-                <w:bCs/>
-                <w:sz w:val="16"/>
-                <w:szCs w:val="16"/>
-              </w:rPr>
-              <w:t>PREENCHER AQUI</w:t>
-            </w:r>
           </w:p>
         </w:tc>
       </w:tr>
@@ -1489,8 +1350,8 @@
             <w:vMerge/>
             <w:tcBorders>
               <w:top w:val="single" w:sz="2" w:space="0" w:color="000000"/>
-              <w:left w:val="single" w:sz="2" w:space="0" w:color="000000"/>
-              <w:bottom w:val="single" w:sz="2" w:space="0" w:color="000000"/>
+              <w:left w:val="single" w:sz="12" w:space="0" w:color="auto"/>
+              <w:bottom w:val="single" w:sz="12" w:space="0" w:color="auto"/>
               <w:right w:val="single" w:sz="2" w:space="0" w:color="000000"/>
             </w:tcBorders>
           </w:tcPr>
@@ -1510,7 +1371,7 @@
             <w:tcBorders>
               <w:top w:val="single" w:sz="2" w:space="0" w:color="000000"/>
               <w:left w:val="single" w:sz="2" w:space="0" w:color="000000"/>
-              <w:bottom w:val="single" w:sz="2" w:space="0" w:color="000000"/>
+              <w:bottom w:val="single" w:sz="12" w:space="0" w:color="auto"/>
               <w:right w:val="single" w:sz="2" w:space="0" w:color="000000"/>
             </w:tcBorders>
             <w:tcMar>
@@ -1549,7 +1410,7 @@
             <w:tcBorders>
               <w:top w:val="single" w:sz="2" w:space="0" w:color="000000"/>
               <w:left w:val="single" w:sz="2" w:space="0" w:color="000000"/>
-              <w:bottom w:val="single" w:sz="2" w:space="0" w:color="000000"/>
+              <w:bottom w:val="single" w:sz="12" w:space="0" w:color="auto"/>
               <w:right w:val="single" w:sz="2" w:space="0" w:color="000000"/>
             </w:tcBorders>
             <w:tcMar>
@@ -1584,15 +1445,6 @@
                 <w:szCs w:val="16"/>
               </w:rPr>
             </w:pPr>
-            <w:r>
-              <w:rPr>
-                <w:b/>
-                <w:bCs/>
-                <w:sz w:val="16"/>
-                <w:szCs w:val="16"/>
-              </w:rPr>
-              <w:t>PREENCHER AQUI</w:t>
-            </w:r>
           </w:p>
         </w:tc>
         <w:tc>
@@ -1601,8 +1453,8 @@
             <w:tcBorders>
               <w:top w:val="single" w:sz="2" w:space="0" w:color="000000"/>
               <w:left w:val="single" w:sz="2" w:space="0" w:color="000000"/>
-              <w:bottom w:val="single" w:sz="2" w:space="0" w:color="000000"/>
-              <w:right w:val="single" w:sz="2" w:space="0" w:color="000000"/>
+              <w:bottom w:val="single" w:sz="12" w:space="0" w:color="auto"/>
+              <w:right w:val="single" w:sz="12" w:space="0" w:color="auto"/>
             </w:tcBorders>
             <w:tcMar>
               <w:top w:w="60" w:type="dxa"/>
@@ -1635,15 +1487,6 @@
                 <w:szCs w:val="16"/>
               </w:rPr>
               <w:br/>
-            </w:r>
-            <w:r>
-              <w:rPr>
-                <w:b/>
-                <w:bCs/>
-                <w:sz w:val="16"/>
-                <w:szCs w:val="16"/>
-              </w:rPr>
-              <w:t>PREENCHER AQUI</w:t>
             </w:r>
           </w:p>
         </w:tc>
@@ -1689,10 +1532,10 @@
             <w:tcW w:w="11378" w:type="dxa"/>
             <w:gridSpan w:val="3"/>
             <w:tcBorders>
-              <w:top w:val="single" w:sz="2" w:space="0" w:color="000000"/>
-              <w:left w:val="single" w:sz="2" w:space="0" w:color="000000"/>
+              <w:top w:val="single" w:sz="12" w:space="0" w:color="auto"/>
+              <w:left w:val="single" w:sz="12" w:space="0" w:color="auto"/>
               <w:bottom w:val="single" w:sz="2" w:space="0" w:color="000000"/>
-              <w:right w:val="single" w:sz="2" w:space="0" w:color="000000"/>
+              <w:right w:val="single" w:sz="12" w:space="0" w:color="auto"/>
             </w:tcBorders>
             <w:shd w:val="clear" w:color="auto" w:fill="D9D9D9"/>
             <w:tcMar>
@@ -1714,8 +1557,8 @@
               <w:rPr>
                 <w:b/>
                 <w:bCs/>
-                <w:sz w:val="16"/>
-                <w:szCs w:val="16"/>
+                <w:sz w:val="20"/>
+                <w:szCs w:val="20"/>
               </w:rPr>
               <w:t>DEPENDENTES</w:t>
             </w:r>
@@ -1730,7 +1573,50 @@
           <w:tcPr>
             <w:tcW w:w="5249" w:type="dxa"/>
             <w:tcBorders>
-              <w:top w:val="single" w:sz="2" w:space="0" w:color="000000"/>
+              <w:top w:val="single" w:sz="12" w:space="0" w:color="auto"/>
+              <w:left w:val="single" w:sz="12" w:space="0" w:color="auto"/>
+              <w:bottom w:val="single" w:sz="2" w:space="0" w:color="000000"/>
+              <w:right w:val="single" w:sz="2" w:space="0" w:color="000000"/>
+            </w:tcBorders>
+            <w:tcMar>
+              <w:top w:w="60" w:type="dxa"/>
+              <w:left w:w="100" w:type="dxa"/>
+              <w:bottom w:w="80" w:type="dxa"/>
+              <w:right w:w="100" w:type="dxa"/>
+            </w:tcMar>
+          </w:tcPr>
+          <w:p>
+            <w:pPr>
+              <w:rPr>
+                <w:sz w:val="16"/>
+                <w:szCs w:val="16"/>
+              </w:rPr>
+            </w:pPr>
+            <w:r>
+              <w:rPr>
+                <w:b/>
+                <w:bCs/>
+                <w:sz w:val="16"/>
+                <w:szCs w:val="16"/>
+              </w:rPr>
+              <w:t>Nome:</w:t>
+            </w:r>
+          </w:p>
+          <w:p>
+            <w:pPr>
+              <w:spacing w:before="60"/>
+              <w:rPr>
+                <w:sz w:val="16"/>
+                <w:szCs w:val="16"/>
+              </w:rPr>
+            </w:pPr>
+          </w:p>
+        </w:tc>
+        <w:tc>
+          <w:tcPr>
+            <w:tcW w:w="2571" w:type="dxa"/>
+            <w:tcBorders>
+              <w:top w:val="single" w:sz="12" w:space="0" w:color="auto"/>
               <w:left w:val="single" w:sz="2" w:space="0" w:color="000000"/>
               <w:bottom w:val="single" w:sz="2" w:space="0" w:color="000000"/>
               <w:right w:val="single" w:sz="2" w:space="0" w:color="000000"/>
@@ -1756,7 +1642,7 @@
                 <w:sz w:val="16"/>
                 <w:szCs w:val="16"/>
               </w:rPr>
-              <w:t>Nome:</w:t>
+              <w:t>Data de nascimento:</w:t>
             </w:r>
           </w:p>
           <w:p>
@@ -1767,25 +1653,16 @@
                 <w:szCs w:val="16"/>
               </w:rPr>
             </w:pPr>
-            <w:r>
-              <w:rPr>
-                <w:b/>
-                <w:bCs/>
-                <w:sz w:val="16"/>
-                <w:szCs w:val="16"/>
-              </w:rPr>
-              <w:t>PREENCHER AQUI</w:t>
-            </w:r>
-          </w:p>
-        </w:tc>
-        <w:tc>
-          <w:tcPr>
-            <w:tcW w:w="2571" w:type="dxa"/>
-            <w:tcBorders>
-              <w:top w:val="single" w:sz="2" w:space="0" w:color="000000"/>
+          </w:p>
+        </w:tc>
+        <w:tc>
+          <w:tcPr>
+            <w:tcW w:w="3556" w:type="dxa"/>
+            <w:tcBorders>
+              <w:top w:val="single" w:sz="12" w:space="0" w:color="auto"/>
               <w:left w:val="single" w:sz="2" w:space="0" w:color="000000"/>
               <w:bottom w:val="single" w:sz="2" w:space="0" w:color="000000"/>
-              <w:right w:val="single" w:sz="2" w:space="0" w:color="000000"/>
+              <w:right w:val="single" w:sz="12" w:space="0" w:color="auto"/>
             </w:tcBorders>
             <w:tcMar>
               <w:top w:w="60" w:type="dxa"/>
@@ -1808,7 +1685,7 @@
                 <w:sz w:val="16"/>
                 <w:szCs w:val="16"/>
               </w:rPr>
-              <w:t>Data de nascimento:</w:t>
+              <w:t>CPF (do dependente):</w:t>
             </w:r>
           </w:p>
           <w:p>
@@ -1819,67 +1696,6 @@
                 <w:szCs w:val="16"/>
               </w:rPr>
             </w:pPr>
-            <w:r>
-              <w:rPr>
-                <w:b/>
-                <w:bCs/>
-                <w:sz w:val="16"/>
-                <w:szCs w:val="16"/>
-              </w:rPr>
-              <w:t>PREENCHER AQUI</w:t>
-            </w:r>
-          </w:p>
-        </w:tc>
-        <w:tc>
-          <w:tcPr>
-            <w:tcW w:w="3556" w:type="dxa"/>
-            <w:tcBorders>
-              <w:top w:val="single" w:sz="2" w:space="0" w:color="000000"/>
-              <w:left w:val="single" w:sz="2" w:space="0" w:color="000000"/>
-              <w:bottom w:val="single" w:sz="2" w:space="0" w:color="000000"/>
-              <w:right w:val="single" w:sz="2" w:space="0" w:color="000000"/>
-            </w:tcBorders>
-            <w:tcMar>
-              <w:top w:w="60" w:type="dxa"/>
-              <w:left w:w="100" w:type="dxa"/>
-              <w:bottom w:w="80" w:type="dxa"/>
-              <w:right w:w="100" w:type="dxa"/>
-            </w:tcMar>
-          </w:tcPr>
-          <w:p>
-            <w:pPr>
-              <w:rPr>
-                <w:sz w:val="16"/>
-                <w:szCs w:val="16"/>
-              </w:rPr>
-            </w:pPr>
-            <w:r>
-              <w:rPr>
-                <w:b/>
-                <w:bCs/>
-                <w:sz w:val="16"/>
-                <w:szCs w:val="16"/>
-              </w:rPr>
-              <w:t>CPF (do dependente):</w:t>
-            </w:r>
-          </w:p>
-          <w:p>
-            <w:pPr>
-              <w:spacing w:before="60"/>
-              <w:rPr>
-                <w:sz w:val="16"/>
-                <w:szCs w:val="16"/>
-              </w:rPr>
-            </w:pPr>
-            <w:r>
-              <w:rPr>
-                <w:b/>
-                <w:bCs/>
-                <w:sz w:val="16"/>
-                <w:szCs w:val="16"/>
-              </w:rPr>
-              <w:t>PREENCHER AQUI</w:t>
-            </w:r>
           </w:p>
         </w:tc>
       </w:tr>
@@ -1892,7 +1708,7 @@
             <w:tcW w:w="5249" w:type="dxa"/>
             <w:tcBorders>
               <w:top w:val="single" w:sz="2" w:space="0" w:color="000000"/>
-              <w:left w:val="single" w:sz="2" w:space="0" w:color="000000"/>
+              <w:left w:val="single" w:sz="12" w:space="0" w:color="auto"/>
               <w:bottom w:val="single" w:sz="2" w:space="0" w:color="000000"/>
               <w:right w:val="single" w:sz="2" w:space="0" w:color="000000"/>
             </w:tcBorders>
@@ -1928,15 +1744,6 @@
                 <w:szCs w:val="16"/>
               </w:rPr>
             </w:pPr>
-            <w:r>
-              <w:rPr>
-                <w:b/>
-                <w:bCs/>
-                <w:sz w:val="16"/>
-                <w:szCs w:val="16"/>
-              </w:rPr>
-              <w:t>PREENCHER AQUI</w:t>
-            </w:r>
           </w:p>
         </w:tc>
         <w:tc>
@@ -1980,15 +1787,6 @@
                 <w:szCs w:val="16"/>
               </w:rPr>
             </w:pPr>
-            <w:r>
-              <w:rPr>
-                <w:b/>
-                <w:bCs/>
-                <w:sz w:val="16"/>
-                <w:szCs w:val="16"/>
-              </w:rPr>
-              <w:t>PREENCHER AQUI</w:t>
-            </w:r>
           </w:p>
         </w:tc>
         <w:tc>
@@ -1998,7 +1796,7 @@
               <w:top w:val="single" w:sz="2" w:space="0" w:color="000000"/>
               <w:left w:val="single" w:sz="2" w:space="0" w:color="000000"/>
               <w:bottom w:val="single" w:sz="2" w:space="0" w:color="000000"/>
-              <w:right w:val="single" w:sz="2" w:space="0" w:color="000000"/>
+              <w:right w:val="single" w:sz="12" w:space="0" w:color="auto"/>
             </w:tcBorders>
             <w:tcMar>
               <w:top w:w="60" w:type="dxa"/>
@@ -2032,15 +1830,6 @@
                 <w:szCs w:val="16"/>
               </w:rPr>
             </w:pPr>
-            <w:r>
-              <w:rPr>
-                <w:b/>
-                <w:bCs/>
-                <w:sz w:val="16"/>
-                <w:szCs w:val="16"/>
-              </w:rPr>
-              <w:t>PREENCHER AQUI</w:t>
-            </w:r>
           </w:p>
         </w:tc>
       </w:tr>
@@ -2053,7 +1842,7 @@
             <w:tcW w:w="5249" w:type="dxa"/>
             <w:tcBorders>
               <w:top w:val="single" w:sz="2" w:space="0" w:color="000000"/>
-              <w:left w:val="single" w:sz="2" w:space="0" w:color="000000"/>
+              <w:left w:val="single" w:sz="12" w:space="0" w:color="auto"/>
               <w:bottom w:val="single" w:sz="2" w:space="0" w:color="000000"/>
               <w:right w:val="single" w:sz="2" w:space="0" w:color="000000"/>
             </w:tcBorders>
@@ -2089,15 +1878,6 @@
                 <w:szCs w:val="16"/>
               </w:rPr>
             </w:pPr>
-            <w:r>
-              <w:rPr>
-                <w:b/>
-                <w:bCs/>
-                <w:sz w:val="16"/>
-                <w:szCs w:val="16"/>
-              </w:rPr>
-              <w:t>PREENCHER AQUI</w:t>
-            </w:r>
           </w:p>
         </w:tc>
         <w:tc>
@@ -2141,15 +1921,6 @@
                 <w:szCs w:val="16"/>
               </w:rPr>
             </w:pPr>
-            <w:r>
-              <w:rPr>
-                <w:b/>
-                <w:bCs/>
-                <w:sz w:val="16"/>
-                <w:szCs w:val="16"/>
-              </w:rPr>
-              <w:t>PREENCHER AQUI</w:t>
-            </w:r>
           </w:p>
         </w:tc>
         <w:tc>
@@ -2159,7 +1930,7 @@
               <w:top w:val="single" w:sz="2" w:space="0" w:color="000000"/>
               <w:left w:val="single" w:sz="2" w:space="0" w:color="000000"/>
               <w:bottom w:val="single" w:sz="2" w:space="0" w:color="000000"/>
-              <w:right w:val="single" w:sz="2" w:space="0" w:color="000000"/>
+              <w:right w:val="single" w:sz="12" w:space="0" w:color="auto"/>
             </w:tcBorders>
             <w:tcMar>
               <w:top w:w="60" w:type="dxa"/>
@@ -2193,15 +1964,6 @@
                 <w:szCs w:val="16"/>
               </w:rPr>
             </w:pPr>
-            <w:r>
-              <w:rPr>
-                <w:b/>
-                <w:bCs/>
-                <w:sz w:val="16"/>
-                <w:szCs w:val="16"/>
-              </w:rPr>
-              <w:t>PREENCHER AQUI</w:t>
-            </w:r>
           </w:p>
         </w:tc>
       </w:tr>
@@ -2214,8 +1976,8 @@
             <w:tcW w:w="5249" w:type="dxa"/>
             <w:tcBorders>
               <w:top w:val="single" w:sz="2" w:space="0" w:color="000000"/>
-              <w:left w:val="single" w:sz="2" w:space="0" w:color="000000"/>
-              <w:bottom w:val="single" w:sz="2" w:space="0" w:color="000000"/>
+              <w:left w:val="single" w:sz="12" w:space="0" w:color="auto"/>
+              <w:bottom w:val="single" w:sz="12" w:space="0" w:color="auto"/>
               <w:right w:val="single" w:sz="2" w:space="0" w:color="000000"/>
             </w:tcBorders>
             <w:tcMar>
@@ -2250,15 +2012,6 @@
                 <w:szCs w:val="16"/>
               </w:rPr>
             </w:pPr>
-            <w:r>
-              <w:rPr>
-                <w:b/>
-                <w:bCs/>
-                <w:sz w:val="16"/>
-                <w:szCs w:val="16"/>
-              </w:rPr>
-              <w:t>PREENCHER AQUI</w:t>
-            </w:r>
           </w:p>
         </w:tc>
         <w:tc>
@@ -2267,7 +2020,7 @@
             <w:tcBorders>
               <w:top w:val="single" w:sz="2" w:space="0" w:color="000000"/>
               <w:left w:val="single" w:sz="2" w:space="0" w:color="000000"/>
-              <w:bottom w:val="single" w:sz="2" w:space="0" w:color="000000"/>
+              <w:bottom w:val="single" w:sz="12" w:space="0" w:color="auto"/>
               <w:right w:val="single" w:sz="2" w:space="0" w:color="000000"/>
             </w:tcBorders>
             <w:tcMar>
@@ -2302,15 +2055,6 @@
                 <w:szCs w:val="16"/>
               </w:rPr>
             </w:pPr>
-            <w:r>
-              <w:rPr>
-                <w:b/>
-                <w:bCs/>
-                <w:sz w:val="16"/>
-                <w:szCs w:val="16"/>
-              </w:rPr>
-              <w:t>PREENCHER AQUI</w:t>
-            </w:r>
           </w:p>
         </w:tc>
         <w:tc>
@@ -2319,8 +2063,8 @@
             <w:tcBorders>
               <w:top w:val="single" w:sz="2" w:space="0" w:color="000000"/>
               <w:left w:val="single" w:sz="2" w:space="0" w:color="000000"/>
-              <w:bottom w:val="single" w:sz="2" w:space="0" w:color="000000"/>
-              <w:right w:val="single" w:sz="2" w:space="0" w:color="000000"/>
+              <w:bottom w:val="single" w:sz="12" w:space="0" w:color="auto"/>
+              <w:right w:val="single" w:sz="12" w:space="0" w:color="auto"/>
             </w:tcBorders>
             <w:tcMar>
               <w:top w:w="60" w:type="dxa"/>
@@ -2354,15 +2098,6 @@
                 <w:szCs w:val="16"/>
               </w:rPr>
             </w:pPr>
-            <w:r>
-              <w:rPr>
-                <w:b/>
-                <w:bCs/>
-                <w:sz w:val="16"/>
-                <w:szCs w:val="16"/>
-              </w:rPr>
-              <w:t>PREENCHER AQUI</w:t>
-            </w:r>
           </w:p>
         </w:tc>
       </w:tr>
@@ -2407,10 +2142,10 @@
             <w:tcW w:w="11395" w:type="dxa"/>
             <w:gridSpan w:val="3"/>
             <w:tcBorders>
-              <w:top w:val="single" w:sz="2" w:space="0" w:color="000000"/>
-              <w:left w:val="single" w:sz="2" w:space="0" w:color="000000"/>
-              <w:bottom w:val="single" w:sz="2" w:space="0" w:color="000000"/>
-              <w:right w:val="single" w:sz="2" w:space="0" w:color="000000"/>
+              <w:top w:val="single" w:sz="12" w:space="0" w:color="auto"/>
+              <w:left w:val="single" w:sz="12" w:space="0" w:color="auto"/>
+              <w:bottom w:val="single" w:sz="12" w:space="0" w:color="auto"/>
+              <w:right w:val="single" w:sz="12" w:space="0" w:color="auto"/>
             </w:tcBorders>
             <w:shd w:val="clear" w:color="auto" w:fill="D9D9D9"/>
             <w:tcMar>
@@ -2432,8 +2167,8 @@
               <w:rPr>
                 <w:b/>
                 <w:bCs/>
-                <w:sz w:val="16"/>
-                <w:szCs w:val="16"/>
+                <w:sz w:val="20"/>
+                <w:szCs w:val="20"/>
               </w:rPr>
               <w:t>BENEFÍCIOS - VALE TRANSPORTE</w:t>
             </w:r>
@@ -2448,7 +2183,44 @@
           <w:tcPr>
             <w:tcW w:w="5270" w:type="dxa"/>
             <w:tcBorders>
-              <w:top w:val="single" w:sz="2" w:space="0" w:color="000000"/>
+              <w:top w:val="single" w:sz="12" w:space="0" w:color="auto"/>
+              <w:left w:val="single" w:sz="12" w:space="0" w:color="auto"/>
+              <w:bottom w:val="single" w:sz="2" w:space="0" w:color="000000"/>
+              <w:right w:val="single" w:sz="2" w:space="0" w:color="000000"/>
+            </w:tcBorders>
+            <w:shd w:val="clear" w:color="auto" w:fill="D9D9D9"/>
+            <w:tcMar>
+              <w:top w:w="60" w:type="dxa"/>
+              <w:left w:w="100" w:type="dxa"/>
+              <w:bottom w:w="60" w:type="dxa"/>
+              <w:right w:w="100" w:type="dxa"/>
+            </w:tcMar>
+            <w:vAlign w:val="center"/>
+          </w:tcPr>
+          <w:p>
+            <w:pPr>
+              <w:jc w:val="center"/>
+              <w:rPr>
+                <w:sz w:val="16"/>
+                <w:szCs w:val="16"/>
+              </w:rPr>
+            </w:pPr>
+            <w:r>
+              <w:rPr>
+                <w:b/>
+                <w:bCs/>
+                <w:sz w:val="16"/>
+                <w:szCs w:val="16"/>
+              </w:rPr>
+              <w:t>VALE TRANSPORTE</w:t>
+            </w:r>
+          </w:p>
+        </w:tc>
+        <w:tc>
+          <w:tcPr>
+            <w:tcW w:w="2562" w:type="dxa"/>
+            <w:tcBorders>
+              <w:top w:val="single" w:sz="12" w:space="0" w:color="auto"/>
               <w:left w:val="single" w:sz="2" w:space="0" w:color="000000"/>
               <w:bottom w:val="single" w:sz="2" w:space="0" w:color="000000"/>
               <w:right w:val="single" w:sz="2" w:space="0" w:color="000000"/>
@@ -2477,55 +2249,18 @@
                 <w:sz w:val="16"/>
                 <w:szCs w:val="16"/>
               </w:rPr>
-              <w:t>VALE TRANSPORTE</w:t>
-            </w:r>
-          </w:p>
-        </w:tc>
-        <w:tc>
-          <w:tcPr>
-            <w:tcW w:w="2562" w:type="dxa"/>
-            <w:tcBorders>
-              <w:top w:val="single" w:sz="2" w:space="0" w:color="000000"/>
+              <w:t>QUANTIDADE</w:t>
+            </w:r>
+          </w:p>
+        </w:tc>
+        <w:tc>
+          <w:tcPr>
+            <w:tcW w:w="3562" w:type="dxa"/>
+            <w:tcBorders>
+              <w:top w:val="single" w:sz="12" w:space="0" w:color="auto"/>
               <w:left w:val="single" w:sz="2" w:space="0" w:color="000000"/>
               <w:bottom w:val="single" w:sz="2" w:space="0" w:color="000000"/>
-              <w:right w:val="single" w:sz="2" w:space="0" w:color="000000"/>
-            </w:tcBorders>
-            <w:shd w:val="clear" w:color="auto" w:fill="D9D9D9"/>
-            <w:tcMar>
-              <w:top w:w="60" w:type="dxa"/>
-              <w:left w:w="100" w:type="dxa"/>
-              <w:bottom w:w="60" w:type="dxa"/>
-              <w:right w:w="100" w:type="dxa"/>
-            </w:tcMar>
-            <w:vAlign w:val="center"/>
-          </w:tcPr>
-          <w:p>
-            <w:pPr>
-              <w:jc w:val="center"/>
-              <w:rPr>
-                <w:sz w:val="16"/>
-                <w:szCs w:val="16"/>
-              </w:rPr>
-            </w:pPr>
-            <w:r>
-              <w:rPr>
-                <w:b/>
-                <w:bCs/>
-                <w:sz w:val="16"/>
-                <w:szCs w:val="16"/>
-              </w:rPr>
-              <w:t>QUANTIDADE</w:t>
-            </w:r>
-          </w:p>
-        </w:tc>
-        <w:tc>
-          <w:tcPr>
-            <w:tcW w:w="3562" w:type="dxa"/>
-            <w:tcBorders>
-              <w:top w:val="single" w:sz="2" w:space="0" w:color="000000"/>
-              <w:left w:val="single" w:sz="2" w:space="0" w:color="000000"/>
-              <w:bottom w:val="single" w:sz="2" w:space="0" w:color="000000"/>
-              <w:right w:val="single" w:sz="2" w:space="0" w:color="000000"/>
+              <w:right w:val="single" w:sz="12" w:space="0" w:color="auto"/>
             </w:tcBorders>
             <w:shd w:val="clear" w:color="auto" w:fill="D9D9D9"/>
             <w:tcMar>
@@ -2565,7 +2300,7 @@
             <w:tcW w:w="5270" w:type="dxa"/>
             <w:tcBorders>
               <w:top w:val="single" w:sz="2" w:space="0" w:color="000000"/>
-              <w:left w:val="single" w:sz="2" w:space="0" w:color="000000"/>
+              <w:left w:val="single" w:sz="12" w:space="0" w:color="auto"/>
               <w:bottom w:val="single" w:sz="2" w:space="0" w:color="000000"/>
               <w:right w:val="single" w:sz="2" w:space="0" w:color="000000"/>
             </w:tcBorders>
@@ -2618,15 +2353,6 @@
                 <w:szCs w:val="16"/>
               </w:rPr>
             </w:pPr>
-            <w:r>
-              <w:rPr>
-                <w:b/>
-                <w:bCs/>
-                <w:sz w:val="16"/>
-                <w:szCs w:val="16"/>
-              </w:rPr>
-              <w:t>PREENCHER AQUI</w:t>
-            </w:r>
           </w:p>
         </w:tc>
         <w:tc>
@@ -2636,7 +2362,7 @@
               <w:top w:val="single" w:sz="2" w:space="0" w:color="000000"/>
               <w:left w:val="single" w:sz="2" w:space="0" w:color="000000"/>
               <w:bottom w:val="single" w:sz="2" w:space="0" w:color="000000"/>
-              <w:right w:val="single" w:sz="2" w:space="0" w:color="000000"/>
+              <w:right w:val="single" w:sz="12" w:space="0" w:color="auto"/>
             </w:tcBorders>
             <w:tcMar>
               <w:top w:w="60" w:type="dxa"/>
@@ -2652,15 +2378,6 @@
                 <w:szCs w:val="16"/>
               </w:rPr>
             </w:pPr>
-            <w:r>
-              <w:rPr>
-                <w:b/>
-                <w:bCs/>
-                <w:sz w:val="16"/>
-                <w:szCs w:val="16"/>
-              </w:rPr>
-              <w:t>PREENCHER AQUI</w:t>
-            </w:r>
           </w:p>
         </w:tc>
       </w:tr>
@@ -2673,7 +2390,7 @@
             <w:tcW w:w="5270" w:type="dxa"/>
             <w:tcBorders>
               <w:top w:val="single" w:sz="2" w:space="0" w:color="000000"/>
-              <w:left w:val="single" w:sz="2" w:space="0" w:color="000000"/>
+              <w:left w:val="single" w:sz="12" w:space="0" w:color="auto"/>
               <w:bottom w:val="single" w:sz="2" w:space="0" w:color="000000"/>
               <w:right w:val="single" w:sz="2" w:space="0" w:color="000000"/>
             </w:tcBorders>
@@ -2726,15 +2443,6 @@
                 <w:szCs w:val="16"/>
               </w:rPr>
             </w:pPr>
-            <w:r>
-              <w:rPr>
-                <w:b/>
-                <w:bCs/>
-                <w:sz w:val="16"/>
-                <w:szCs w:val="16"/>
-              </w:rPr>
-              <w:t>PREENCHER AQUI</w:t>
-            </w:r>
           </w:p>
         </w:tc>
         <w:tc>
@@ -2744,7 +2452,7 @@
               <w:top w:val="single" w:sz="2" w:space="0" w:color="000000"/>
               <w:left w:val="single" w:sz="2" w:space="0" w:color="000000"/>
               <w:bottom w:val="single" w:sz="2" w:space="0" w:color="000000"/>
-              <w:right w:val="single" w:sz="2" w:space="0" w:color="000000"/>
+              <w:right w:val="single" w:sz="12" w:space="0" w:color="auto"/>
             </w:tcBorders>
             <w:tcMar>
               <w:top w:w="60" w:type="dxa"/>
@@ -2760,15 +2468,6 @@
                 <w:szCs w:val="16"/>
               </w:rPr>
             </w:pPr>
-            <w:r>
-              <w:rPr>
-                <w:b/>
-                <w:bCs/>
-                <w:sz w:val="16"/>
-                <w:szCs w:val="16"/>
-              </w:rPr>
-              <w:t>PREENCHER AQUI</w:t>
-            </w:r>
           </w:p>
         </w:tc>
       </w:tr>
@@ -2781,8 +2480,8 @@
             <w:tcW w:w="5270" w:type="dxa"/>
             <w:tcBorders>
               <w:top w:val="single" w:sz="2" w:space="0" w:color="000000"/>
-              <w:left w:val="single" w:sz="2" w:space="0" w:color="000000"/>
-              <w:bottom w:val="single" w:sz="2" w:space="0" w:color="000000"/>
+              <w:left w:val="single" w:sz="12" w:space="0" w:color="auto"/>
+              <w:bottom w:val="single" w:sz="12" w:space="0" w:color="auto"/>
               <w:right w:val="single" w:sz="2" w:space="0" w:color="000000"/>
             </w:tcBorders>
             <w:tcMar>
@@ -2817,7 +2516,7 @@
             <w:tcBorders>
               <w:top w:val="single" w:sz="2" w:space="0" w:color="000000"/>
               <w:left w:val="single" w:sz="2" w:space="0" w:color="000000"/>
-              <w:bottom w:val="single" w:sz="2" w:space="0" w:color="000000"/>
+              <w:bottom w:val="single" w:sz="12" w:space="0" w:color="auto"/>
               <w:right w:val="single" w:sz="2" w:space="0" w:color="000000"/>
             </w:tcBorders>
             <w:tcMar>
@@ -2834,15 +2533,6 @@
                 <w:szCs w:val="16"/>
               </w:rPr>
             </w:pPr>
-            <w:r>
-              <w:rPr>
-                <w:b/>
-                <w:bCs/>
-                <w:sz w:val="16"/>
-                <w:szCs w:val="16"/>
-              </w:rPr>
-              <w:t>PREENCHER AQUI</w:t>
-            </w:r>
           </w:p>
         </w:tc>
         <w:tc>
@@ -2851,8 +2541,8 @@
             <w:tcBorders>
               <w:top w:val="single" w:sz="2" w:space="0" w:color="000000"/>
               <w:left w:val="single" w:sz="2" w:space="0" w:color="000000"/>
-              <w:bottom w:val="single" w:sz="2" w:space="0" w:color="000000"/>
-              <w:right w:val="single" w:sz="2" w:space="0" w:color="000000"/>
+              <w:bottom w:val="single" w:sz="12" w:space="0" w:color="auto"/>
+              <w:right w:val="single" w:sz="12" w:space="0" w:color="auto"/>
             </w:tcBorders>
             <w:tcMar>
               <w:top w:w="60" w:type="dxa"/>
@@ -2868,15 +2558,6 @@
                 <w:szCs w:val="16"/>
               </w:rPr>
             </w:pPr>
-            <w:r>
-              <w:rPr>
-                <w:b/>
-                <w:bCs/>
-                <w:sz w:val="16"/>
-                <w:szCs w:val="16"/>
-              </w:rPr>
-              <w:t>PREENCHER AQUI</w:t>
-            </w:r>
           </w:p>
         </w:tc>
       </w:tr>
@@ -2921,10 +2602,10 @@
             <w:tcW w:w="11397" w:type="dxa"/>
             <w:gridSpan w:val="3"/>
             <w:tcBorders>
-              <w:top w:val="single" w:sz="2" w:space="0" w:color="000000"/>
-              <w:left w:val="single" w:sz="2" w:space="0" w:color="000000"/>
-              <w:bottom w:val="single" w:sz="2" w:space="0" w:color="000000"/>
-              <w:right w:val="single" w:sz="2" w:space="0" w:color="000000"/>
+              <w:top w:val="single" w:sz="12" w:space="0" w:color="auto"/>
+              <w:left w:val="single" w:sz="12" w:space="0" w:color="auto"/>
+              <w:bottom w:val="single" w:sz="12" w:space="0" w:color="auto"/>
+              <w:right w:val="single" w:sz="12" w:space="0" w:color="auto"/>
             </w:tcBorders>
             <w:shd w:val="clear" w:color="auto" w:fill="D9D9D9"/>
             <w:tcMar>
@@ -2950,8 +2631,8 @@
               <w:rPr>
                 <w:b/>
                 <w:bCs/>
-                <w:sz w:val="16"/>
-                <w:szCs w:val="16"/>
+                <w:sz w:val="20"/>
+                <w:szCs w:val="20"/>
               </w:rPr>
               <w:t>VALE REFEIÇÃO/ALIMENTAÇÃO</w:t>
             </w:r>
@@ -2966,9 +2647,9 @@
           <w:tcPr>
             <w:tcW w:w="3504" w:type="dxa"/>
             <w:tcBorders>
-              <w:top w:val="single" w:sz="2" w:space="0" w:color="000000"/>
-              <w:left w:val="single" w:sz="2" w:space="0" w:color="000000"/>
-              <w:bottom w:val="single" w:sz="2" w:space="0" w:color="000000"/>
+              <w:top w:val="single" w:sz="12" w:space="0" w:color="auto"/>
+              <w:left w:val="single" w:sz="12" w:space="0" w:color="auto"/>
+              <w:bottom w:val="single" w:sz="12" w:space="0" w:color="auto"/>
               <w:right w:val="single" w:sz="2" w:space="0" w:color="000000"/>
             </w:tcBorders>
             <w:tcMar>
@@ -3012,9 +2693,9 @@
           <w:tcPr>
             <w:tcW w:w="3505" w:type="dxa"/>
             <w:tcBorders>
-              <w:top w:val="single" w:sz="2" w:space="0" w:color="000000"/>
+              <w:top w:val="single" w:sz="12" w:space="0" w:color="auto"/>
               <w:left w:val="single" w:sz="2" w:space="0" w:color="000000"/>
-              <w:bottom w:val="single" w:sz="2" w:space="0" w:color="000000"/>
+              <w:bottom w:val="single" w:sz="12" w:space="0" w:color="auto"/>
               <w:right w:val="single" w:sz="2" w:space="0" w:color="000000"/>
             </w:tcBorders>
             <w:tcMar>
@@ -3058,10 +2739,10 @@
           <w:tcPr>
             <w:tcW w:w="4387" w:type="dxa"/>
             <w:tcBorders>
-              <w:top w:val="single" w:sz="2" w:space="0" w:color="000000"/>
+              <w:top w:val="single" w:sz="12" w:space="0" w:color="auto"/>
               <w:left w:val="single" w:sz="2" w:space="0" w:color="000000"/>
-              <w:bottom w:val="single" w:sz="2" w:space="0" w:color="000000"/>
-              <w:right w:val="single" w:sz="2" w:space="0" w:color="000000"/>
+              <w:bottom w:val="single" w:sz="12" w:space="0" w:color="auto"/>
+              <w:right w:val="single" w:sz="12" w:space="0" w:color="auto"/>
             </w:tcBorders>
             <w:tcMar>
               <w:top w:w="80" w:type="dxa"/>
@@ -3196,20 +2877,6 @@
           <w:szCs w:val="16"/>
         </w:rPr>
         <w:t xml:space="preserve"> </w:t>
-      </w:r>
-      <w:r>
-        <w:rPr>
-          <w:sz w:val="16"/>
-          <w:szCs w:val="16"/>
-        </w:rPr>
-        <w:br/>
-      </w:r>
-      <w:r>
-        <w:rPr>
-          <w:sz w:val="16"/>
-          <w:szCs w:val="16"/>
-        </w:rPr>
-        <w:br/>
       </w:r>
       <w:r>
         <w:rPr>

</xml_diff>